<commit_message>
Consolidate to one report, update numbers after leakage-fix retrain
- Remove BaoCao_CuoiKy_RBA_MLP_Fuzzy.docx (duplicate of BaoCao_TongHop_RBA.docx)
- Fix hardcoded paths in _gen_baocao_rba.js (was pointing at another machine's
  path) and point docx require at the global npm install
- Update all metrics in BaoCao_TongHop_RBA.docx to match the latest retrain
  (AUROC 0.878, AUPRC 0.218, Recall 84.3%, Precision 11.3%)
- Move the global-stats leakage item from "chưa sửa" (8.2, unfixed) to a new
  8.2 "Lỗi đã phát hiện và khắc phục" section alongside the xmin/xmax fix —
  the code fix already landed, the report text hadn't caught up
- Update STATUS.md and top-level README.md to match current state
</commit_message>
<xml_diff>
--- a/BaoCao_TongHop_RBA.docx
+++ b/BaoCao_TongHop_RBA.docx
@@ -5023,7 +5023,7 @@
                 <w:sz w:val="23"/>
                 <w:szCs w:val="23"/>
               </w:rPr>
-              <w:t xml:space="preserve">0.8774</w:t>
+              <w:t xml:space="preserve">0.8781</w:t>
             </w:r>
           </w:p>
         </w:tc>
@@ -5103,7 +5103,7 @@
                 <w:sz w:val="23"/>
                 <w:szCs w:val="23"/>
               </w:rPr>
-              <w:t xml:space="preserve">0.2188</w:t>
+              <w:t xml:space="preserve">0.2180</w:t>
             </w:r>
           </w:p>
         </w:tc>
@@ -5183,7 +5183,7 @@
                 <w:sz w:val="23"/>
                 <w:szCs w:val="23"/>
               </w:rPr>
-              <w:t xml:space="preserve">0.7896</w:t>
+              <w:t xml:space="preserve">0.7933</w:t>
             </w:r>
           </w:p>
         </w:tc>
@@ -5263,7 +5263,7 @@
                 <w:sz w:val="23"/>
                 <w:szCs w:val="23"/>
               </w:rPr>
-              <w:t xml:space="preserve">0.1117</w:t>
+              <w:t xml:space="preserve">0.1133</w:t>
             </w:r>
           </w:p>
         </w:tc>
@@ -5343,7 +5343,7 @@
                 <w:sz w:val="23"/>
                 <w:szCs w:val="23"/>
               </w:rPr>
-              <w:t xml:space="preserve">0.8449</w:t>
+              <w:t xml:space="preserve">0.8428</w:t>
             </w:r>
           </w:p>
         </w:tc>
@@ -5423,7 +5423,7 @@
                 <w:sz w:val="23"/>
                 <w:szCs w:val="23"/>
               </w:rPr>
-              <w:t xml:space="preserve">0.1974</w:t>
+              <w:t xml:space="preserve">0.1998</w:t>
             </w:r>
           </w:p>
         </w:tc>
@@ -5679,7 +5679,7 @@
           <w:sz w:val="26"/>
           <w:szCs w:val="26"/>
         </w:rPr>
-        <w:t xml:space="preserve">Recall cao (84.5%) + Precision thấp (11.2%) là đánh đổi có chủ đích: </w:t>
+        <w:t xml:space="preserve">Recall cao (84.3%) + Precision thấp (11.3%) là đánh đổi có chủ đích: </w:t>
       </w:r>
       <w:r>
         <w:rPr>
@@ -5726,7 +5726,7 @@
           <w:sz w:val="26"/>
           <w:szCs w:val="26"/>
         </w:rPr>
-        <w:t xml:space="preserve">AUPRC (0.219, so với baseline ngẫu nhiên ~0.03) mới phản ánh chất lượng thật, vì Accuracy/AUROC bị “thổi phồng” bởi lớp âm áp đảo.</w:t>
+        <w:t xml:space="preserve">AUPRC (0.218, so với baseline ngẫu nhiên ~0.03) mới phản ánh chất lượng thật, vì Accuracy/AUROC bị “thổi phồng” bởi lớp âm áp đảo.</w:t>
       </w:r>
     </w:p>
     <w:p>
@@ -5746,7 +5746,7 @@
           <w:sz w:val="24"/>
           <w:szCs w:val="24"/>
         </w:rPr>
-        <w:t xml:space="preserve">Số liệu bổ sung (chỉ có trong báo cáo gốc): ở ngưỡng tối ưu F1 = 0.829, Precision tăng lên 27.8%, F1 = 0.327, đổi lại Recall giảm còn 39.8%.</w:t>
+        <w:t xml:space="preserve">Số liệu bổ sung: ở ngưỡng tối ưu F1 = 0.844, Precision tăng lên 28.9%, F1 = 0.324, đổi lại Recall giảm còn 37.0%.</w:t>
       </w:r>
     </w:p>
     <w:p>
@@ -6126,7 +6126,7 @@
           <w:sz w:val="26"/>
           <w:szCs w:val="26"/>
         </w:rPr>
-        <w:t xml:space="preserve">Đã phát hiện &amp; sửa lỗi thực: xmin/xmax batch-local trong hàm thuộc → đã lưu min/max toàn cục vào pipeline để inference đúng.</w:t>
+        <w:t xml:space="preserve">Đã phát hiện &amp; sửa 2 lỗi thực trong mã nguồn (xem 8.2).</w:t>
       </w:r>
     </w:p>
     <w:p>
@@ -6143,7 +6143,7 @@
           <w:sz w:val="27"/>
           <w:szCs w:val="27"/>
         </w:rPr>
-        <w:t xml:space="preserve">8.2. Điểm yếu / rủi ro</w:t>
+        <w:t xml:space="preserve">8.2. Lỗi đã phát hiện và khắc phục</w:t>
       </w:r>
     </w:p>
     <w:p>
@@ -6158,11 +6158,22 @@
       <w:r>
         <w:rPr>
           <w:rFonts w:ascii="Times New Roman" w:cs="Times New Roman" w:eastAsia="Times New Roman" w:hAnsi="Times New Roman"/>
-          <w:color w:val="000000"/>
-          <w:sz w:val="26"/>
-          <w:szCs w:val="26"/>
-        </w:rPr>
-        <w:t xml:space="preserve">Precision thấp (11.2%) ở ngưỡng 0.5 — nhiều báo động giả; chưa tối ưu ngưỡng ở quyết định cuối.</w:t>
+          <w:b/>
+          <w:bCs/>
+          <w:color w:val="000000"/>
+          <w:sz w:val="26"/>
+          <w:szCs w:val="26"/>
+        </w:rPr>
+        <w:t xml:space="preserve">xmin/xmax batch-local trong hàm thuộc mờ: </w:t>
+      </w:r>
+      <w:r>
+        <w:rPr>
+          <w:rFonts w:ascii="Times New Roman" w:cs="Times New Roman" w:eastAsia="Times New Roman" w:hAnsi="Times New Roman"/>
+          <w:color w:val="000000"/>
+          <w:sz w:val="26"/>
+          <w:szCs w:val="26"/>
+        </w:rPr>
+        <w:t xml:space="preserve">low_med_high() từng tính lại xmin/xmax từ chính batch truyền vào transform() thay vì dùng giá trị toàn cục của train. Ổn định với batch lớn nhưng làm méo kết quả khi suy luận trên 1-2 dòng đơn lẻ. Đã sửa: fit() lưu thêm minmax_ toàn cục, inference gán lại từ pipeline thay vì tính lại.</w:t>
       </w:r>
     </w:p>
     <w:p>
@@ -6183,16 +6194,53 @@
           <w:sz w:val="26"/>
           <w:szCs w:val="26"/>
         </w:rPr>
-        <w:t xml:space="preserve">Rò rỉ thống kê toàn cục tinh vi (CHƯA sửa): </w:t>
-      </w:r>
-      <w:r>
-        <w:rPr>
-          <w:rFonts w:ascii="Times New Roman" w:cs="Times New Roman" w:eastAsia="Times New Roman" w:hAnsi="Times New Roman"/>
-          <w:color w:val="000000"/>
-          <w:sz w:val="26"/>
-          <w:szCs w:val="26"/>
-        </w:rPr>
-        <w:t xml:space="preserve">median RTT và value_counts cho country/asn rarity tính trên TOÀN BỘ df (gồm cả val/test) vì engineer_features chạy trước prepare_splits. Nên tính chỉ trên train.</w:t>
+        <w:t xml:space="preserve">Rò rỉ thống kê toàn cục (RTT/Country/ASN rarity): </w:t>
+      </w:r>
+      <w:r>
+        <w:rPr>
+          <w:rFonts w:ascii="Times New Roman" w:cs="Times New Roman" w:eastAsia="Times New Roman" w:hAnsi="Times New Roman"/>
+          <w:color w:val="000000"/>
+          <w:sz w:val="26"/>
+          <w:szCs w:val="26"/>
+        </w:rPr>
+        <w:t xml:space="preserve">trước đây median RTT và tần suất Country/ASN được tính trên TOÀN BỘ dữ liệu (gồm cả val/test) ngay trong engineer_features(), trước khi chia tập — một dạng leakage tinh vi. Đã sửa bằng fit_global_stats()/apply_global_stats() trong features.py: 2 thống kê này giờ fit CHỈ trên train, áp dụng nhất quán cho val/test và inference (lưu trong pipeline["global_stats"]).</w:t>
+      </w:r>
+    </w:p>
+    <w:p>
+      <w:pPr>
+        <w:pBdr>
+          <w:left w:val="single" w:color="F59E0B" w:sz="18" w:space="8"/>
+        </w:pBdr>
+        <w:shd w:fill="FFF8E1" w:val="clear"/>
+        <w:spacing w:after="120" w:line="290"/>
+      </w:pPr>
+      <w:r>
+        <w:rPr>
+          <w:rFonts w:ascii="Times New Roman" w:cs="Times New Roman" w:eastAsia="Times New Roman" w:hAnsi="Times New Roman"/>
+          <w:i/>
+          <w:iCs/>
+          <w:color w:val="5D4037"/>
+          <w:sz w:val="24"/>
+          <w:szCs w:val="24"/>
+        </w:rPr>
+        <w:t xml:space="preserve">Cả 2 lỗi trên đều đã được kiểm thử lại: huấn luyện lại từ đầu, metrics gần như không đổi (đúng như dự đoán vì ảnh hưởng nhẹ ở quy mô batch lớn), và inference.py demo cho kết quả hợp lý, tách biệt rõ giữa 2 kịch bản rủi ro cao/thấp.</w:t>
+      </w:r>
+    </w:p>
+    <w:p>
+      <w:pPr>
+        <w:pStyle w:val="Heading2"/>
+        <w:spacing w:after="100" w:before="200"/>
+      </w:pPr>
+      <w:r>
+        <w:rPr>
+          <w:rFonts w:ascii="Times New Roman" w:cs="Times New Roman" w:eastAsia="Times New Roman" w:hAnsi="Times New Roman"/>
+          <w:b/>
+          <w:bCs/>
+          <w:color w:val="2E75B6"/>
+          <w:sz w:val="27"/>
+          <w:szCs w:val="27"/>
+        </w:rPr>
+        <w:t xml:space="preserve">8.3. Điểm yếu / rủi ro còn lại</w:t>
       </w:r>
     </w:p>
     <w:p>
@@ -6211,7 +6259,7 @@
           <w:sz w:val="26"/>
           <w:szCs w:val="26"/>
         </w:rPr>
-        <w:t xml:space="preserve">8 luật fuzzy thiết kế thủ công theo trực giác, chưa tối ưu tự động.</w:t>
+        <w:t xml:space="preserve">Precision thấp (11.3%) ở ngưỡng 0.5 — nhiều báo động giả; ngưỡng tối ưu F1 (0.844) cải thiện Precision lên 28.9% nhưng đánh đổi Recall giảm còn 37.0%.</w:t>
       </w:r>
     </w:p>
     <w:p>
@@ -6230,24 +6278,7 @@
           <w:sz w:val="26"/>
           <w:szCs w:val="26"/>
         </w:rPr>
-        <w:t xml:space="preserve">requirements dùng “&gt;=” (không ghim phiên bản chính xác) → có thể lệch hành vi giữa các phiên bản.</w:t>
-      </w:r>
-    </w:p>
-    <w:p>
-      <w:pPr>
-        <w:pStyle w:val="Heading2"/>
-        <w:spacing w:after="100" w:before="200"/>
-      </w:pPr>
-      <w:r>
-        <w:rPr>
-          <w:rFonts w:ascii="Times New Roman" w:cs="Times New Roman" w:eastAsia="Times New Roman" w:hAnsi="Times New Roman"/>
-          <w:b/>
-          <w:bCs/>
-          <w:color w:val="2E75B6"/>
-          <w:sz w:val="27"/>
-          <w:szCs w:val="27"/>
-        </w:rPr>
-        <w:t xml:space="preserve">8.3. Hướng phát triển</w:t>
+        <w:t xml:space="preserve">8 luật fuzzy thiết kế thủ công theo trực giác, chưa tối ưu tự động.</w:t>
       </w:r>
     </w:p>
     <w:p>
@@ -6266,7 +6297,24 @@
           <w:sz w:val="26"/>
           <w:szCs w:val="26"/>
         </w:rPr>
-        <w:t xml:space="preserve">Thử Focal Loss / tinh chỉnh pos_weight để tăng Precision mà không giảm Recall quá nhiều.</w:t>
+        <w:t xml:space="preserve">requirements dùng “&gt;=” (không ghim phiên bản chính xác) → có thể lệch hành vi giữa các phiên bản.</w:t>
+      </w:r>
+    </w:p>
+    <w:p>
+      <w:pPr>
+        <w:pStyle w:val="Heading2"/>
+        <w:spacing w:after="100" w:before="200"/>
+      </w:pPr>
+      <w:r>
+        <w:rPr>
+          <w:rFonts w:ascii="Times New Roman" w:cs="Times New Roman" w:eastAsia="Times New Roman" w:hAnsi="Times New Roman"/>
+          <w:b/>
+          <w:bCs/>
+          <w:color w:val="2E75B6"/>
+          <w:sz w:val="27"/>
+          <w:szCs w:val="27"/>
+        </w:rPr>
+        <w:t xml:space="preserve">8.4. Hướng phát triển</w:t>
       </w:r>
     </w:p>
     <w:p>
@@ -6285,7 +6333,7 @@
           <w:sz w:val="26"/>
           <w:szCs w:val="26"/>
         </w:rPr>
-        <w:t xml:space="preserve">Chọn ngưỡng theo ma trận chi phí thực tế (cân bằng bỏ sót tấn công vs làm phiền người dùng).</w:t>
+        <w:t xml:space="preserve">Thử Focal Loss / tinh chỉnh pos_weight để tăng Precision mà không giảm Recall quá nhiều.</w:t>
       </w:r>
     </w:p>
     <w:p>
@@ -6304,7 +6352,7 @@
           <w:sz w:val="26"/>
           <w:szCs w:val="26"/>
         </w:rPr>
-        <w:t xml:space="preserve">Tối ưu/học tự động hệ mờ (ANFIS hoặc thuật toán tiến hóa) thay vì thiết kế luật thủ công.</w:t>
+        <w:t xml:space="preserve">Chọn ngưỡng theo ma trận chi phí thực tế (cân bằng bỏ sót tấn công vs làm phiền người dùng).</w:t>
       </w:r>
     </w:p>
     <w:p>
@@ -6323,7 +6371,26 @@
           <w:sz w:val="26"/>
           <w:szCs w:val="26"/>
         </w:rPr>
-        <w:t xml:space="preserve">Khắc phục leakage thống kê toàn cục; ghim phiên bản thư viện để tái lập.</w:t>
+        <w:t xml:space="preserve">Tối ưu/học tự động hệ mờ (ANFIS hoặc thuật toán tiến hóa) thay vì thiết kế luật thủ công.</w:t>
+      </w:r>
+    </w:p>
+    <w:p>
+      <w:pPr>
+        <w:pStyle w:val="ListParagraph"/>
+        <w:numPr>
+          <w:ilvl w:val="0"/>
+          <w:numId w:val="1"/>
+        </w:numPr>
+        <w:spacing w:after="60" w:line="290"/>
+      </w:pPr>
+      <w:r>
+        <w:rPr>
+          <w:rFonts w:ascii="Times New Roman" w:cs="Times New Roman" w:eastAsia="Times New Roman" w:hAnsi="Times New Roman"/>
+          <w:color w:val="000000"/>
+          <w:sz w:val="26"/>
+          <w:szCs w:val="26"/>
+        </w:rPr>
+        <w:t xml:space="preserve">Ghim phiên bản thư viện chính xác (thay vì “&gt;=”) để tái lập kết quả ổn định giữa các máy.</w:t>
       </w:r>
     </w:p>
     <w:p>
@@ -6340,7 +6407,7 @@
           <w:sz w:val="27"/>
           <w:szCs w:val="27"/>
         </w:rPr>
-        <w:t xml:space="preserve">8.4. Kết luận</w:t>
+        <w:t xml:space="preserve">8.5. Kết luận</w:t>
       </w:r>
     </w:p>
     <w:p>
@@ -6354,7 +6421,7 @@
           <w:sz w:val="26"/>
           <w:szCs w:val="26"/>
         </w:rPr>
-        <w:t xml:space="preserve">Dự án xây dựng thành công hệ lai MLP + Mamdani Fuzzy trên ~500.000 lượt đăng nhập cho bài toán RBA. Hệ mờ mã hóa tri thức chuyên gia (8 luật) thành đặc trưng giải thích được, ghép cùng đặc trưng số/one-hot làm đầu vào MLP 3 tầng ẩn (128→64→32). Kết quả test (AUROC 0.877, AUPRC 0.219, Recall 84.5%, Precision 11.2% ở ngưỡng 0.5) cho thấy mô hình bắt được phần lớn tấn công — phù hợp mục tiêu bảo mật — dù tỉ lệ báo động giả còn cao, một đánh đổi chấp nhận được và có thể tinh chỉnh qua ngưỡng.</w:t>
+        <w:t xml:space="preserve">Dự án xây dựng thành công hệ lai MLP + Mamdani Fuzzy trên ~500.000 lượt đăng nhập cho bài toán RBA. Hệ mờ mã hóa tri thức chuyên gia (8 luật) thành đặc trưng giải thích được, ghép cùng đặc trưng số/one-hot làm đầu vào MLP 3 tầng ẩn (128→64→32). Kết quả test (AUROC 0.878, AUPRC 0.218, Recall 84.3%, Precision 11.3% ở ngưỡng 0.5) cho thấy mô hình bắt được phần lớn tấn công — phù hợp mục tiêu bảo mật — dù tỉ lệ báo động giả còn cao, một đánh đổi chấp nhận được và có thể tinh chỉnh qua ngưỡng. Quá trình rà soát mã nguồn còn phát hiện và khắc phục thành công 2 lỗi thực trong pipeline (mục 8.2), thể hiện giá trị của việc hiểu rõ thuật toán ở mức triển khai.</w:t>
       </w:r>
     </w:p>
     <w:sectPr>

</xml_diff>

<commit_message>
Add student names/MSSV/class to title pages
Phạm Trung Kiên (2591310), Nguyễn Minh Tuấn (2591325), Lê Phú Nhân
(2591317) — Lớp KHMT 2025B. Added to both BaoCao_TongHop_RBA.docx
(previously had no name field at all) and the pptx title slide.
</commit_message>
<xml_diff>
--- a/BaoCao_TongHop_RBA.docx
+++ b/BaoCao_TongHop_RBA.docx
@@ -53,7 +53,7 @@
     </w:p>
     <w:p>
       <w:pPr>
-        <w:spacing w:after="80"/>
+        <w:spacing w:after="500"/>
         <w:jc w:val="center"/>
       </w:pPr>
       <w:r>
@@ -66,6 +66,83 @@
           <w:szCs w:val="26"/>
         </w:rPr>
         <w:t xml:space="preserve">Học Máy Nâng Cao — Tài liệu đọc hiểu &amp; tổng hợp mã nguồn</w:t>
+      </w:r>
+    </w:p>
+    <w:p>
+      <w:pPr>
+        <w:spacing w:after="100"/>
+        <w:jc w:val="center"/>
+      </w:pPr>
+      <w:r>
+        <w:rPr>
+          <w:rFonts w:ascii="Times New Roman" w:cs="Times New Roman" w:eastAsia="Times New Roman" w:hAnsi="Times New Roman"/>
+          <w:b/>
+          <w:bCs/>
+          <w:color w:val="000000"/>
+          <w:sz w:val="25"/>
+          <w:szCs w:val="25"/>
+        </w:rPr>
+        <w:t xml:space="preserve">Sinh viên thực hiện:</w:t>
+      </w:r>
+    </w:p>
+    <w:p>
+      <w:pPr>
+        <w:spacing w:after="60"/>
+        <w:jc w:val="center"/>
+      </w:pPr>
+      <w:r>
+        <w:rPr>
+          <w:rFonts w:ascii="Times New Roman" w:cs="Times New Roman" w:eastAsia="Times New Roman" w:hAnsi="Times New Roman"/>
+          <w:color w:val="000000"/>
+          <w:sz w:val="25"/>
+          <w:szCs w:val="25"/>
+        </w:rPr>
+        <w:t xml:space="preserve">Phạm Trung Kiên — MSSV 2591310</w:t>
+      </w:r>
+    </w:p>
+    <w:p>
+      <w:pPr>
+        <w:spacing w:after="60"/>
+        <w:jc w:val="center"/>
+      </w:pPr>
+      <w:r>
+        <w:rPr>
+          <w:rFonts w:ascii="Times New Roman" w:cs="Times New Roman" w:eastAsia="Times New Roman" w:hAnsi="Times New Roman"/>
+          <w:color w:val="000000"/>
+          <w:sz w:val="25"/>
+          <w:szCs w:val="25"/>
+        </w:rPr>
+        <w:t xml:space="preserve">Nguyễn Minh Tuấn — MSSV 2591325</w:t>
+      </w:r>
+    </w:p>
+    <w:p>
+      <w:pPr>
+        <w:spacing w:after="60"/>
+        <w:jc w:val="center"/>
+      </w:pPr>
+      <w:r>
+        <w:rPr>
+          <w:rFonts w:ascii="Times New Roman" w:cs="Times New Roman" w:eastAsia="Times New Roman" w:hAnsi="Times New Roman"/>
+          <w:color w:val="000000"/>
+          <w:sz w:val="25"/>
+          <w:szCs w:val="25"/>
+        </w:rPr>
+        <w:t xml:space="preserve">Lê Phú Nhân — MSSV 2591317</w:t>
+      </w:r>
+    </w:p>
+    <w:p>
+      <w:pPr>
+        <w:spacing w:before="100"/>
+        <w:jc w:val="center"/>
+      </w:pPr>
+      <w:r>
+        <w:rPr>
+          <w:rFonts w:ascii="Times New Roman" w:cs="Times New Roman" w:eastAsia="Times New Roman" w:hAnsi="Times New Roman"/>
+          <w:color w:val="000000"/>
+          <w:sz w:val="25"/>
+          <w:szCs w:val="25"/>
+        </w:rPr>
+        <w:t xml:space="preserve">Lớp: KHMT 2025B</w:t>
       </w:r>
     </w:p>
     <w:p>

</xml_diff>

<commit_message>
Fix corrupted XML in BaoCao_TongHop_RBA.docx (Word refused to open it)
document.xml had two schema violations breaking the file:
- 52x <w:b w:val="function bold() { [native code] }"/> — a JS Boolean
  method got serialized into the XML instead of "1"/"0" (bug in whatever
  script last touched this file's bold runs)
- 1x relativeHeight="-1" on the background frame image — must be a
  non-negative integer per the OOXML schema

Fixed both by patching the raw XML directly (word/document.xml only,
all other parts byte-identical). Verified: no remaining "function"/
"native code" artifacts anywhere in the package, and every XML part is
well-formed.
</commit_message>
<xml_diff>
--- a/BaoCao_TongHop_RBA.docx
+++ b/BaoCao_TongHop_RBA.docx
@@ -9,7 +9,7 @@
       </w:pPr>
       <w:r>
         <w:drawing>
-          <wp:anchor distT="0" distB="0" distL="0" distR="0" simplePos="0" allowOverlap="1" behindDoc="1" locked="0" layoutInCell="1" relativeHeight="-1">
+          <wp:anchor distT="0" distB="0" distL="0" distR="0" simplePos="0" allowOverlap="1" behindDoc="1" locked="0" layoutInCell="1" relativeHeight="0">
             <wp:simplePos x="0" y="0"/>
             <wp:positionH relativeFrom="page">
               <wp:posOffset>200000</wp:posOffset>
@@ -379,8 +379,8 @@
       <w:r>
         <w:rPr>
           <w:rFonts w:ascii="Times New Roman" w:cs="Times New Roman" w:eastAsia="Times New Roman" w:hAnsi="Times New Roman"/>
-          <w:b w:val="function bold() { [native code] }"/>
-          <w:bCs w:val="function bold() { [native code] }"/>
+          <w:b w:val="1"/>
+          <w:bCs w:val="1"/>
           <w:color w:val="000000"/>
           <w:sz w:val="26"/>
           <w:szCs w:val="26"/>
@@ -487,8 +487,8 @@
       <w:r>
         <w:rPr>
           <w:rFonts w:ascii="Times New Roman" w:cs="Times New Roman" w:eastAsia="Times New Roman" w:hAnsi="Times New Roman"/>
-          <w:b w:val="function bold() { [native code] }"/>
-          <w:bCs w:val="function bold() { [native code] }"/>
+          <w:b w:val="1"/>
+          <w:bCs w:val="1"/>
           <w:color w:val="000000"/>
           <w:sz w:val="26"/>
           <w:szCs w:val="26"/>
@@ -526,8 +526,8 @@
       <w:r>
         <w:rPr>
           <w:rFonts w:ascii="Times New Roman" w:cs="Times New Roman" w:eastAsia="Times New Roman" w:hAnsi="Times New Roman"/>
-          <w:b w:val="function bold() { [native code] }"/>
-          <w:bCs w:val="function bold() { [native code] }"/>
+          <w:b w:val="1"/>
+          <w:bCs w:val="1"/>
           <w:color w:val="000000"/>
           <w:sz w:val="26"/>
           <w:szCs w:val="26"/>
@@ -548,8 +548,8 @@
       <w:r>
         <w:rPr>
           <w:rFonts w:ascii="Times New Roman" w:cs="Times New Roman" w:eastAsia="Times New Roman" w:hAnsi="Times New Roman"/>
-          <w:b w:val="function bold() { [native code] }"/>
-          <w:bCs w:val="function bold() { [native code] }"/>
+          <w:b w:val="1"/>
+          <w:bCs w:val="1"/>
           <w:color w:val="000000"/>
           <w:sz w:val="26"/>
           <w:szCs w:val="26"/>
@@ -570,8 +570,8 @@
       <w:r>
         <w:rPr>
           <w:rFonts w:ascii="Times New Roman" w:cs="Times New Roman" w:eastAsia="Times New Roman" w:hAnsi="Times New Roman"/>
-          <w:b w:val="function bold() { [native code] }"/>
-          <w:bCs w:val="function bold() { [native code] }"/>
+          <w:b w:val="1"/>
+          <w:bCs w:val="1"/>
           <w:color w:val="000000"/>
           <w:sz w:val="26"/>
           <w:szCs w:val="26"/>
@@ -642,8 +642,8 @@
       <w:r>
         <w:rPr>
           <w:rFonts w:ascii="Times New Roman" w:cs="Times New Roman" w:eastAsia="Times New Roman" w:hAnsi="Times New Roman"/>
-          <w:b w:val="function bold() { [native code] }"/>
-          <w:bCs w:val="function bold() { [native code] }"/>
+          <w:b w:val="1"/>
+          <w:bCs w:val="1"/>
           <w:color w:val="000000"/>
           <w:sz w:val="26"/>
           <w:szCs w:val="26"/>
@@ -677,8 +677,8 @@
       <w:r>
         <w:rPr>
           <w:rFonts w:ascii="Times New Roman" w:cs="Times New Roman" w:eastAsia="Times New Roman" w:hAnsi="Times New Roman"/>
-          <w:b w:val="function bold() { [native code] }"/>
-          <w:bCs w:val="function bold() { [native code] }"/>
+          <w:b w:val="1"/>
+          <w:bCs w:val="1"/>
           <w:color w:val="000000"/>
           <w:sz w:val="26"/>
           <w:szCs w:val="26"/>
@@ -710,8 +710,8 @@
       <w:r>
         <w:rPr>
           <w:rFonts w:ascii="Times New Roman" w:cs="Times New Roman" w:eastAsia="Times New Roman" w:hAnsi="Times New Roman"/>
-          <w:b w:val="function bold() { [native code] }"/>
-          <w:bCs w:val="function bold() { [native code] }"/>
+          <w:b w:val="1"/>
+          <w:bCs w:val="1"/>
           <w:color w:val="000000"/>
           <w:sz w:val="26"/>
           <w:szCs w:val="26"/>
@@ -745,8 +745,8 @@
       <w:r>
         <w:rPr>
           <w:rFonts w:ascii="Times New Roman" w:cs="Times New Roman" w:eastAsia="Times New Roman" w:hAnsi="Times New Roman"/>
-          <w:b w:val="function bold() { [native code] }"/>
-          <w:bCs w:val="function bold() { [native code] }"/>
+          <w:b w:val="1"/>
+          <w:bCs w:val="1"/>
           <w:color w:val="000000"/>
           <w:sz w:val="26"/>
           <w:szCs w:val="26"/>
@@ -780,8 +780,8 @@
       <w:r>
         <w:rPr>
           <w:rFonts w:ascii="Times New Roman" w:cs="Times New Roman" w:eastAsia="Times New Roman" w:hAnsi="Times New Roman"/>
-          <w:b w:val="function bold() { [native code] }"/>
-          <w:bCs w:val="function bold() { [native code] }"/>
+          <w:b w:val="1"/>
+          <w:bCs w:val="1"/>
           <w:color w:val="000000"/>
           <w:sz w:val="26"/>
           <w:szCs w:val="26"/>
@@ -894,8 +894,8 @@
       <w:r>
         <w:rPr>
           <w:rFonts w:ascii="Times New Roman" w:cs="Times New Roman" w:eastAsia="Times New Roman" w:hAnsi="Times New Roman"/>
-          <w:b w:val="function bold() { [native code] }"/>
-          <w:bCs w:val="function bold() { [native code] }"/>
+          <w:b w:val="1"/>
+          <w:bCs w:val="1"/>
           <w:color w:val="000000"/>
           <w:sz w:val="26"/>
           <w:szCs w:val="26"/>
@@ -912,8 +912,8 @@
       <w:r>
         <w:rPr>
           <w:rFonts w:ascii="Times New Roman" w:cs="Times New Roman" w:eastAsia="Times New Roman" w:hAnsi="Times New Roman"/>
-          <w:b w:val="function bold() { [native code] }"/>
-          <w:bCs w:val="function bold() { [native code] }"/>
+          <w:b w:val="1"/>
+          <w:bCs w:val="1"/>
           <w:color w:val="000000"/>
           <w:sz w:val="26"/>
           <w:szCs w:val="26"/>
@@ -978,8 +978,8 @@
       <w:r>
         <w:rPr>
           <w:rFonts w:ascii="Times New Roman" w:cs="Times New Roman" w:eastAsia="Times New Roman" w:hAnsi="Times New Roman"/>
-          <w:b w:val="function bold() { [native code] }"/>
-          <w:bCs w:val="function bold() { [native code] }"/>
+          <w:b w:val="1"/>
+          <w:bCs w:val="1"/>
           <w:color w:val="000000"/>
           <w:sz w:val="26"/>
           <w:szCs w:val="26"/>
@@ -1075,8 +1075,8 @@
       <w:r>
         <w:rPr>
           <w:rFonts w:ascii="Times New Roman" w:cs="Times New Roman" w:eastAsia="Times New Roman" w:hAnsi="Times New Roman"/>
-          <w:b w:val="function bold() { [native code] }"/>
-          <w:bCs w:val="function bold() { [native code] }"/>
+          <w:b w:val="1"/>
+          <w:bCs w:val="1"/>
           <w:color w:val="000000"/>
           <w:sz w:val="26"/>
           <w:szCs w:val="26"/>
@@ -2318,8 +2318,8 @@
       <w:r>
         <w:rPr>
           <w:rFonts w:ascii="Times New Roman" w:cs="Times New Roman" w:eastAsia="Times New Roman" w:hAnsi="Times New Roman"/>
-          <w:b w:val="function bold() { [native code] }"/>
-          <w:bCs w:val="function bold() { [native code] }"/>
+          <w:b w:val="1"/>
+          <w:bCs w:val="1"/>
           <w:color w:val="000000"/>
           <w:sz w:val="26"/>
           <w:szCs w:val="26"/>
@@ -2572,8 +2572,8 @@
       <w:r>
         <w:rPr>
           <w:rFonts w:ascii="Times New Roman" w:cs="Times New Roman" w:eastAsia="Times New Roman" w:hAnsi="Times New Roman"/>
-          <w:b w:val="function bold() { [native code] }"/>
-          <w:bCs w:val="function bold() { [native code] }"/>
+          <w:b w:val="1"/>
+          <w:bCs w:val="1"/>
           <w:color w:val="000000"/>
           <w:sz w:val="26"/>
           <w:szCs w:val="26"/>
@@ -2668,8 +2668,8 @@
       <w:r>
         <w:rPr>
           <w:rFonts w:ascii="Times New Roman" w:cs="Times New Roman" w:eastAsia="Times New Roman" w:hAnsi="Times New Roman"/>
-          <w:b w:val="function bold() { [native code] }"/>
-          <w:bCs w:val="function bold() { [native code] }"/>
+          <w:b w:val="1"/>
+          <w:bCs w:val="1"/>
           <w:color w:val="000000"/>
           <w:sz w:val="26"/>
           <w:szCs w:val="26"/>
@@ -2824,8 +2824,8 @@
       <w:r>
         <w:rPr>
           <w:rFonts w:ascii="Times New Roman" w:cs="Times New Roman" w:eastAsia="Times New Roman" w:hAnsi="Times New Roman"/>
-          <w:b w:val="function bold() { [native code] }"/>
-          <w:bCs w:val="function bold() { [native code] }"/>
+          <w:b w:val="1"/>
+          <w:bCs w:val="1"/>
           <w:color w:val="000000"/>
           <w:sz w:val="26"/>
           <w:szCs w:val="26"/>
@@ -2859,8 +2859,8 @@
       <w:r>
         <w:rPr>
           <w:rFonts w:ascii="Times New Roman" w:cs="Times New Roman" w:eastAsia="Times New Roman" w:hAnsi="Times New Roman"/>
-          <w:b w:val="function bold() { [native code] }"/>
-          <w:bCs w:val="function bold() { [native code] }"/>
+          <w:b w:val="1"/>
+          <w:bCs w:val="1"/>
           <w:color w:val="000000"/>
           <w:sz w:val="26"/>
           <w:szCs w:val="26"/>
@@ -3737,8 +3737,8 @@
       <w:r>
         <w:rPr>
           <w:rFonts w:ascii="Times New Roman" w:cs="Times New Roman" w:eastAsia="Times New Roman" w:hAnsi="Times New Roman"/>
-          <w:b w:val="function bold() { [native code] }"/>
-          <w:bCs w:val="function bold() { [native code] }"/>
+          <w:b w:val="1"/>
+          <w:bCs w:val="1"/>
           <w:color w:val="000000"/>
           <w:sz w:val="26"/>
           <w:szCs w:val="26"/>
@@ -3759,8 +3759,8 @@
       <w:r>
         <w:rPr>
           <w:rFonts w:ascii="Times New Roman" w:cs="Times New Roman" w:eastAsia="Times New Roman" w:hAnsi="Times New Roman"/>
-          <w:b w:val="function bold() { [native code] }"/>
-          <w:bCs w:val="function bold() { [native code] }"/>
+          <w:b w:val="1"/>
+          <w:bCs w:val="1"/>
           <w:color w:val="000000"/>
           <w:sz w:val="26"/>
           <w:szCs w:val="26"/>
@@ -3813,8 +3813,8 @@
       <w:r>
         <w:rPr>
           <w:rFonts w:ascii="Times New Roman" w:cs="Times New Roman" w:eastAsia="Times New Roman" w:hAnsi="Times New Roman"/>
-          <w:b w:val="function bold() { [native code] }"/>
-          <w:bCs w:val="function bold() { [native code] }"/>
+          <w:b w:val="1"/>
+          <w:bCs w:val="1"/>
           <w:color w:val="000000"/>
           <w:sz w:val="26"/>
           <w:szCs w:val="26"/>
@@ -3852,8 +3852,8 @@
       <w:r>
         <w:rPr>
           <w:rFonts w:ascii="Times New Roman" w:cs="Times New Roman" w:eastAsia="Times New Roman" w:hAnsi="Times New Roman"/>
-          <w:b w:val="function bold() { [native code] }"/>
-          <w:bCs w:val="function bold() { [native code] }"/>
+          <w:b w:val="1"/>
+          <w:bCs w:val="1"/>
           <w:color w:val="000000"/>
           <w:sz w:val="26"/>
           <w:szCs w:val="26"/>
@@ -3874,8 +3874,8 @@
       <w:r>
         <w:rPr>
           <w:rFonts w:ascii="Times New Roman" w:cs="Times New Roman" w:eastAsia="Times New Roman" w:hAnsi="Times New Roman"/>
-          <w:b w:val="function bold() { [native code] }"/>
-          <w:bCs w:val="function bold() { [native code] }"/>
+          <w:b w:val="1"/>
+          <w:bCs w:val="1"/>
           <w:color w:val="000000"/>
           <w:sz w:val="26"/>
           <w:szCs w:val="26"/>
@@ -3913,8 +3913,8 @@
       <w:r>
         <w:rPr>
           <w:rFonts w:ascii="Times New Roman" w:cs="Times New Roman" w:eastAsia="Times New Roman" w:hAnsi="Times New Roman"/>
-          <w:b w:val="function bold() { [native code] }"/>
-          <w:bCs w:val="function bold() { [native code] }"/>
+          <w:b w:val="1"/>
+          <w:bCs w:val="1"/>
           <w:color w:val="000000"/>
           <w:sz w:val="26"/>
           <w:szCs w:val="26"/>
@@ -3935,8 +3935,8 @@
       <w:r>
         <w:rPr>
           <w:rFonts w:ascii="Times New Roman" w:cs="Times New Roman" w:eastAsia="Times New Roman" w:hAnsi="Times New Roman"/>
-          <w:b w:val="function bold() { [native code] }"/>
-          <w:bCs w:val="function bold() { [native code] }"/>
+          <w:b w:val="1"/>
+          <w:bCs w:val="1"/>
           <w:color w:val="000000"/>
           <w:sz w:val="26"/>
           <w:szCs w:val="26"/>

</xml_diff>